<commit_message>
Surface the Claude Code function in the five-panel bullet — across all resumes
The Claude Code leverage function baked into the operational analytics
tool is the single most differentiating receipt in the portfolio. It was
not in the master bullet. Updating across master + 11 per-role resumes
(skipping Suffolk one-pager, which Blake already has).

Updated bullet adds:
- "and noise" (the fifth panel — the won't-fix bucket that prevents
  re-evaluating non-actionable items every triage cycle)
- "with a Claude Code function I built into the tool surfacing the
  single highest-leverage action per panel"

Yahoo, UKG Alliances variants updated with parallel changes (their
phrasing is slightly different — "defect triage system" vs "operational
analytics product" — but the load-bearing AI receipt is the same).

All docx + pdf files regenerated from updated markdown.

https://claude.ai/code/session_017dM7V2VFD2VHNDNWBmpDHh
</commit_message>
<xml_diff>
--- a/applications/yahoo/Ian_Cowpar_Resume_Yahoo.docx
+++ b/applications/yahoo/Ian_Cowpar_Resume_Yahoo.docx
@@ -66,7 +66,7 @@
           <w:b w:val="0"/>
           <w:i w:val="0"/>
         </w:rPr>
-        <w:t>Product manager who builds platform-internal systems that reduce cognitive load for the engineers and PMs running on top of them. I find the manual, repeated work — feedback synthesis, defect triage, status reporting — and replace it with AI-assisted workflows that compound at the team level rather than depending on me staying in the room. At UKG I owned a product representing $250M ARR: scaling a PM automation library into shared team capability, designing a five-panel defect triage system across four products with daily refresh and a single highest-leverage action surfaced per view, and building sprint health instrumentation refreshing every 15 minutes across two engineering teams — all of it built for signal, not ceremony.</w:t>
+        <w:t>Product manager who builds platform-internal systems that reduce cognitive load for the engineers and PMs running on top of them. I find the manual, repeated work — feedback synthesis, defect triage, status reporting — and replace it with AI-assisted workflows that compound at the team level rather than depending on me staying in the room. At UKG I owned a product representing $250M ARR: scaling a PM automation library into shared team capability, designing a five-panel defect triage system across four products with a Claude Code function I built into the tool surfacing the highest-leverage action per panel, and building sprint health instrumentation refreshing every 15 minutes across two engineering teams — all of it built for signal, not ceremony.</w:t>
       </w:r>
     </w:p>
     <w:p>
@@ -144,7 +144,7 @@
           <w:b w:val="0"/>
           <w:i w:val="0"/>
         </w:rPr>
-        <w:t>Designed a five-panel defect triage system classifying open issues across customer escalations, code defects, internal bugs, and CVEs; auto-refreshed daily across four products, surfacing a highest-leverage action per view. Replaced manual feedback synthesis with a workflow the team runs without me.</w:t>
+        <w:t>Designed a five-panel defect triage system classifying open issues across customer escalations, code defects, internal bugs, CVEs, and noise; auto-refreshed daily across four products, with a Claude Code function I built into the tool surfacing the highest-leverage action per panel. Replaced manual feedback synthesis with a workflow the team runs without me.</w:t>
       </w:r>
     </w:p>
     <w:p>

</xml_diff>